<commit_message>
Final proposal: add companies studied, make interviews optional
Co-Authored-By: Claude Sonnet 5.5 <noreply@anthropic.com>
Claude-Session: https://claude.ai/code/session_01GombZzS9LLYVmModBqfL5P
</commit_message>
<xml_diff>
--- a/CIS Proposal - AI in Indian Grocery Retail Supply Chain (Final).docx
+++ b/CIS Proposal - AI in Indian Grocery Retail Supply Chain (Final).docx
@@ -85,6 +85,44 @@
     </w:p>
     <w:p>
       <w:pPr>
+        <w:spacing w:after="40"/>
+      </w:pPr>
+      <w:r>
+        <w:rPr>
+          <w:b/>
+        </w:rPr>
+        <w:t>Companies studied:</w:t>
+      </w:r>
+    </w:p>
+    <w:p>
+      <w:pPr>
+        <w:pStyle w:val="ListBullet"/>
+        <w:spacing w:after="40"/>
+      </w:pPr>
+      <w:r>
+        <w:t>Quick commerce (main focus): Blinkit (Eternal) and Instamart (Swiggy). Zepto is included once its updated draft prospectus is read.</w:t>
+      </w:r>
+    </w:p>
+    <w:p>
+      <w:pPr>
+        <w:pStyle w:val="ListBullet"/>
+        <w:spacing w:after="40"/>
+      </w:pPr>
+      <w:r>
+        <w:t>Supermarkets (contrast): DMart, which discloses no AI, with Reliance Retail, More Retail and Spencer's (Nature's Basket) for context. Trent's Star format is noted where its reports allow.</w:t>
+      </w:r>
+    </w:p>
+    <w:p>
+      <w:pPr>
+        <w:pStyle w:val="ListBullet"/>
+        <w:spacing w:after="40"/>
+      </w:pPr>
+      <w:r>
+        <w:t>Global comparators, for what disclosure can look like: Ocado, Tesco, Walmart, Ahold Delhaize and Carrefour.</w:t>
+      </w:r>
+    </w:p>
+    <w:p>
+      <w:pPr>
         <w:pStyle w:val="Heading1"/>
       </w:pPr>
       <w:r>
@@ -176,7 +214,7 @@
         <w:spacing w:after="40"/>
       </w:pPr>
       <w:r>
-        <w:t>RQ3. Which gaps are adoption gaps and which are disclosure gaps, and what do practitioners say about the difference?</w:t>
+        <w:t>RQ3. Which gaps are adoption gaps and which are disclosure gaps, and, if interviews are possible, what do practitioners say about the difference?</w:t>
       </w:r>
     </w:p>
     <w:p>
@@ -1365,7 +1403,7 @@
     </w:p>
     <w:p>
       <w:r>
-        <w:t>Indian quick-commerce disclosures name AI in demand prediction, routing and supply chain but give no outcome metrics; DMart, a leading listed supermarket chain, discloses none; and the one quantified Indian forecasting case (More Retail) dates from 2021 and was co-written with its vendor. No Indian grocer reviewed discloses forecast accuracy, shelf availability or wastage. The study will separate gaps that are real adoption gaps from gaps that are only disclosure gaps, using public documents and a small number of practitioner interviews.</w:t>
+        <w:t>Indian quick-commerce disclosures name AI in demand prediction, routing and supply chain but give no outcome metrics; DMart, a leading listed supermarket chain, discloses none; and the one quantified Indian forecasting case (More Retail) dates from 2021 and was co-written with its vendor. No Indian grocer reviewed discloses forecast accuracy, shelf availability or wastage. The study will separate gaps that are real adoption gaps from gaps that are only disclosure gaps, using public documents and, where I can arrange them, a few practitioner interviews.</w:t>
       </w:r>
     </w:p>
     <w:p>
@@ -1515,7 +1553,7 @@
         <w:spacing w:after="40"/>
       </w:pPr>
       <w:r>
-        <w:t>Interviews: 3 to 4 semi-structured interviews of about 30 minutes with retail planners, category or supply-chain managers, or quick-commerce operations staff, to cover what filings do not. Participants are anonymised, consent is taken before recording or notes, and interview material is labelled as practitioner opinion, not audited fact.</w:t>
+        <w:t>Interviews (optional, if access can be arranged): 3 to 4 semi-structured interviews of about 30 minutes with retail planners, category or supply-chain managers, or quick-commerce operations staff, to cover what filings do not. Participants are anonymised, consent is taken before recording or notes, and interview material is labelled as practitioner opinion, not audited fact. If none can be arranged, the study rests on documents alone and says so in the limitations.</w:t>
       </w:r>
     </w:p>
     <w:p>
@@ -1657,7 +1695,7 @@
         <w:spacing w:after="40"/>
       </w:pPr>
       <w:r>
-        <w:t>Public evidence here is thinner than for the lending alternative I compared earlier (about 66 against 81 out of 100 on the same weighted scorecard), so the study treats the disclosure gap as a finding and adds practitioner interviews as primary data.</w:t>
+        <w:t>Public evidence here is thinner than for the lending alternative I compared earlier (about 66 against 81 out of 100 on the same weighted scorecard), so the study treats the disclosure gap as a finding and adds practitioner interviews where possible.</w:t>
       </w:r>
     </w:p>
     <w:p>
@@ -1666,7 +1704,7 @@
         <w:spacing w:after="40"/>
       </w:pPr>
       <w:r>
-        <w:t>Question 1: because filings give activity and plans more than outcomes, is a study built on disclosed metrics, a gap analysis and a few practitioner interviews acceptable, or are quantified before-and-after outcomes expected for every stage?</w:t>
+        <w:t>Question 1: because filings give activity and plans more than outcomes, is a study built on disclosed metrics, a gap analysis and, if I can arrange them, a few practitioner interviews acceptable, or are quantified before-and-after outcomes expected for every stage?</w:t>
       </w:r>
     </w:p>
     <w:p>

</xml_diff>